<commit_message>
feat: issue compensation vouchers for cancelled showtimes
</commit_message>
<xml_diff>
--- a/docs/requirements/business-rules.docx
+++ b/docs/requirements/business-rules.docx
@@ -3469,14 +3469,8 @@
             <w:vAlign w:val="top"/>
           </w:tcPr>
           <w:p>
-            <w:pPr>
-              <w:rPr/>
-            </w:pPr>
-            <w:r>
-              <w:rPr>
-                <w:rtl w:val="0"/>
-              </w:rPr>
-              <w:t xml:space="preserve">Nếu suất chiếu bị hủy bởi Manager/Admin, các booking đã thanh toán phải chuyển sang Refund Pending.</w:t>
+            <w:r>
+              <w:t>Đối với giao dịch lỗi không phát sinh từ việc Manager/Admin hủy suất chiếu, booking đã thanh toán có thể chuyển sang Refund Pending theo luồng hoàn tiền tương ứng.</w:t>
             </w:r>
           </w:p>
         </w:tc>
@@ -3532,14 +3526,8 @@
             <w:vAlign w:val="top"/>
           </w:tcPr>
           <w:p>
-            <w:pPr>
-              <w:rPr/>
-            </w:pPr>
-            <w:r>
-              <w:rPr>
-                <w:rtl w:val="0"/>
-              </w:rPr>
-              <w:t xml:space="preserve">Nếu hoàn tiền tự động thành công, booking chuyển sang Refunded.</w:t>
+            <w:r>
+              <w:t>Trong luồng hoàn tiền hợp lệ không thuộc chính sách bồi thường hủy suất chiếu, nếu hoàn tiền tự động thành công thì booking chuyển sang Refunded.</w:t>
             </w:r>
           </w:p>
         </w:tc>
@@ -3595,14 +3583,8 @@
             <w:vAlign w:val="top"/>
           </w:tcPr>
           <w:p>
-            <w:pPr>
-              <w:rPr/>
-            </w:pPr>
-            <w:r>
-              <w:rPr>
-                <w:rtl w:val="0"/>
-              </w:rPr>
-              <w:t xml:space="preserve">Nếu hoàn tiền tự động thất bại, booking chuyển sang Manual Refund Required để nhân sự xử lý thủ công.</w:t>
+            <w:r>
+              <w:t>Trong luồng hoàn tiền hợp lệ không thuộc chính sách bồi thường hủy suất chiếu, nếu hoàn tiền tự động thất bại thì booking chuyển sang Manual Refund Required để Admin xử lý.</w:t>
             </w:r>
           </w:p>
         </w:tc>
@@ -3658,14 +3640,8 @@
             <w:vAlign w:val="top"/>
           </w:tcPr>
           <w:p>
-            <w:pPr>
-              <w:rPr/>
-            </w:pPr>
-            <w:r>
-              <w:rPr>
-                <w:rtl w:val="0"/>
-              </w:rPr>
-              <w:t xml:space="preserve">Hệ thống phải gửi thông báo cho Customer khi booking bị hủy hoặc được hoàn tiền.</w:t>
+            <w:r>
+              <w:t>Hệ thống phải gửi thông báo cho Customer khi booking bị hủy, được hoàn tiền hoặc được cấp quyền lợi bồi thường.</w:t>
             </w:r>
           </w:p>
         </w:tc>
@@ -4047,14 +4023,8 @@
             <w:vAlign w:val="top"/>
           </w:tcPr>
           <w:p>
-            <w:pPr>
-              <w:rPr/>
-            </w:pPr>
-            <w:r>
-              <w:rPr>
-                <w:rtl w:val="0"/>
-              </w:rPr>
-              <w:t xml:space="preserve">Nếu hệ thống/rạp thay đổi hoặc hủy dịch vụ do sự cố, hệ thống có thể hoàn tiền, đổi vé hoặc đổi dịch vụ có giá trị tương đương.</w:t>
+            <w:r>
+              <w:t>Khi Manager/Admin hủy suất chiếu do lỗi hoặc quyết định vận hành của rạp, hệ thống phải áp dụng chính sách bồi thường tại BR-93 đến BR-107; các thay đổi dịch vụ khác có thể áp dụng hoàn tiền, đổi vé hoặc dịch vụ tương đương theo chính sách riêng.</w:t>
             </w:r>
           </w:p>
         </w:tc>
@@ -4110,14 +4080,8 @@
             <w:vAlign w:val="top"/>
           </w:tcPr>
           <w:p>
-            <w:pPr>
-              <w:rPr/>
-            </w:pPr>
-            <w:r>
-              <w:rPr>
-                <w:rtl w:val="0"/>
-              </w:rPr>
-              <w:t xml:space="preserve">Nếu Customer đổi sang dịch vụ có giá trị cao hơn, Customer phải thanh toán phần chênh lệch.</w:t>
+            <w:r>
+              <w:t>Nếu Customer chủ động đổi sang dịch vụ có giá trị cao hơn thì Customer phải thanh toán phần chênh lệch; quy tắc này không áp dụng khi dùng voucher vé bồi thường theo BR-95.</w:t>
             </w:r>
           </w:p>
         </w:tc>
@@ -7239,19 +7203,36 @@
     <w:tbl>
       <w:tblPr>
         <w:tblStyle w:val="Table15"/>
-        <w:tblW w:type="auto" w:w="0"/>
-        <w:tblLook w:firstColumn="1" w:firstRow="1" w:lastColumn="0" w:lastRow="0" w:noHBand="0" w:noVBand="1" w:val="04A0"/>
+        <w:tblW w:w="9030.0" w:type="dxa"/>
+        <w:jc w:val="left"/>
+        <w:tblBorders>
+          <w:top w:color="000000" w:space="0" w:sz="0" w:val="nil"/>
+          <w:left w:color="000000" w:space="0" w:sz="0" w:val="nil"/>
+          <w:bottom w:color="000000" w:space="0" w:sz="0" w:val="nil"/>
+          <w:right w:color="000000" w:space="0" w:sz="0" w:val="nil"/>
+          <w:insideH w:color="000000" w:space="0" w:sz="0" w:val="nil"/>
+          <w:insideV w:color="000000" w:space="0" w:sz="0" w:val="nil"/>
+        </w:tblBorders>
+        <w:tblLayout w:type="fixed"/>
+        <w:tblLook w:val="0600"/>
       </w:tblPr>
       <w:tblGrid>
-        <w:gridCol w:w="4514"/>
-        <w:gridCol w:w="4514"/>
+        <w:gridCol w:w="1020"/>
+        <w:gridCol w:w="8010"/>
+        <w:tblGridChange w:id="0">
+          <w:tblGrid>
+            <w:gridCol w:w="1020"/>
+            <w:gridCol w:w="8010"/>
+          </w:tblGrid>
+        </w:tblGridChange>
       </w:tblGrid>
       <w:tr>
         <w:tc>
           <w:tcPr>
-            <w:tcW w:type="dxa" w:w="4514"/>
-          </w:tcPr>
-          <w:p>
+            <w:tcW w:type="dxa" w:w="1020"/>
+          </w:tcPr>
+          <w:p>
+            <w:pPr/>
             <w:r>
               <w:t>Mã</w:t>
             </w:r>
@@ -7259,9 +7240,10 @@
         </w:tc>
         <w:tc>
           <w:tcPr>
-            <w:tcW w:type="dxa" w:w="4514"/>
-          </w:tcPr>
-          <w:p>
+            <w:tcW w:type="dxa" w:w="8010"/>
+          </w:tcPr>
+          <w:p>
+            <w:pPr/>
             <w:r>
               <w:t>Business Rule</w:t>
             </w:r>
@@ -7271,9 +7253,10 @@
       <w:tr>
         <w:tc>
           <w:tcPr>
-            <w:tcW w:type="dxa" w:w="4514"/>
-          </w:tcPr>
-          <w:p>
+            <w:tcW w:type="dxa" w:w="1020"/>
+          </w:tcPr>
+          <w:p>
+            <w:pPr/>
             <w:r>
               <w:t>BR-83</w:t>
             </w:r>
@@ -7281,9 +7264,10 @@
         </w:tc>
         <w:tc>
           <w:tcPr>
-            <w:tcW w:type="dxa" w:w="4514"/>
-          </w:tcPr>
-          <w:p>
+            <w:tcW w:type="dxa" w:w="8010"/>
+          </w:tcPr>
+          <w:p>
+            <w:pPr/>
             <w:r>
               <w:t>Chỉ được hủy suất chiếu khi startTime lớn hơn thời điểm UTC hiện tại.</w:t>
             </w:r>
@@ -7293,9 +7277,10 @@
       <w:tr>
         <w:tc>
           <w:tcPr>
-            <w:tcW w:type="dxa" w:w="4514"/>
-          </w:tcPr>
-          <w:p>
+            <w:tcW w:type="dxa" w:w="1020"/>
+          </w:tcPr>
+          <w:p>
+            <w:pPr/>
             <w:r>
               <w:t>BR-84</w:t>
             </w:r>
@@ -7303,9 +7288,10 @@
         </w:tc>
         <w:tc>
           <w:tcPr>
-            <w:tcW w:type="dxa" w:w="4514"/>
-          </w:tcPr>
-          <w:p>
+            <w:tcW w:type="dxa" w:w="8010"/>
+          </w:tcPr>
+          <w:p>
+            <w:pPr/>
             <w:r>
               <w:t>Link refund claim có hiệu lực 5 phút; hệ thống chỉ lưu hash của token và phải vô hiệu token cũ khi cấp lại.</w:t>
             </w:r>
@@ -7315,9 +7301,10 @@
       <w:tr>
         <w:tc>
           <w:tcPr>
-            <w:tcW w:type="dxa" w:w="4514"/>
-          </w:tcPr>
-          <w:p>
+            <w:tcW w:type="dxa" w:w="1020"/>
+          </w:tcPr>
+          <w:p>
+            <w:pPr/>
             <w:r>
               <w:t>BR-85</w:t>
             </w:r>
@@ -7325,9 +7312,10 @@
         </w:tc>
         <w:tc>
           <w:tcPr>
-            <w:tcW w:type="dxa" w:w="4514"/>
-          </w:tcPr>
-          <w:p>
+            <w:tcW w:type="dxa" w:w="8010"/>
+          </w:tcPr>
+          <w:p>
+            <w:pPr/>
             <w:r>
               <w:t>Customer chỉ được thao tác refund claim thuộc booking của chính mình sau khi đăng nhập.</w:t>
             </w:r>
@@ -7337,9 +7325,10 @@
       <w:tr>
         <w:tc>
           <w:tcPr>
-            <w:tcW w:type="dxa" w:w="4514"/>
-          </w:tcPr>
-          <w:p>
+            <w:tcW w:type="dxa" w:w="1020"/>
+          </w:tcPr>
+          <w:p>
+            <w:pPr/>
             <w:r>
               <w:t>BR-86</w:t>
             </w:r>
@@ -7347,9 +7336,10 @@
         </w:tc>
         <w:tc>
           <w:tcPr>
-            <w:tcW w:type="dxa" w:w="4514"/>
-          </w:tcPr>
-          <w:p>
+            <w:tcW w:type="dxa" w:w="8010"/>
+          </w:tcPr>
+          <w:p>
+            <w:pPr/>
             <w:r>
               <w:t>Tên ngân hàng phải lấy từ danh mục bankCode/BIN; không nhận tên ngân hàng dạng free text.</w:t>
             </w:r>
@@ -7359,9 +7349,10 @@
       <w:tr>
         <w:tc>
           <w:tcPr>
-            <w:tcW w:type="dxa" w:w="4514"/>
-          </w:tcPr>
-          <w:p>
+            <w:tcW w:type="dxa" w:w="1020"/>
+          </w:tcPr>
+          <w:p>
+            <w:pPr/>
             <w:r>
               <w:t>BR-87</w:t>
             </w:r>
@@ -7369,9 +7360,10 @@
         </w:tc>
         <w:tc>
           <w:tcPr>
-            <w:tcW w:type="dxa" w:w="4514"/>
-          </w:tcPr>
-          <w:p>
+            <w:tcW w:type="dxa" w:w="8010"/>
+          </w:tcPr>
+          <w:p>
+            <w:pPr/>
             <w:r>
               <w:t>Số tài khoản chỉ được coi là tồn tại khi provider/bank name-enquiry xác nhận và trả tên chủ tài khoản chuẩn.</w:t>
             </w:r>
@@ -7381,9 +7373,10 @@
       <w:tr>
         <w:tc>
           <w:tcPr>
-            <w:tcW w:type="dxa" w:w="4514"/>
-          </w:tcPr>
-          <w:p>
+            <w:tcW w:type="dxa" w:w="1020"/>
+          </w:tcPr>
+          <w:p>
+            <w:pPr/>
             <w:r>
               <w:t>BR-88</w:t>
             </w:r>
@@ -7391,9 +7384,10 @@
         </w:tc>
         <w:tc>
           <w:tcPr>
-            <w:tcW w:type="dxa" w:w="4514"/>
-          </w:tcPr>
-          <w:p>
+            <w:tcW w:type="dxa" w:w="8010"/>
+          </w:tcPr>
+          <w:p>
+            <w:pPr/>
             <w:r>
               <w:t>Customer phải xác nhận thông tin đã đối chiếu trước khi submit; sau submit không được sửa tài khoản nhận tiền.</w:t>
             </w:r>
@@ -7403,9 +7397,10 @@
       <w:tr>
         <w:tc>
           <w:tcPr>
-            <w:tcW w:type="dxa" w:w="4514"/>
-          </w:tcPr>
-          <w:p>
+            <w:tcW w:type="dxa" w:w="1020"/>
+          </w:tcPr>
+          <w:p>
+            <w:pPr/>
             <w:r>
               <w:t>BR-89</w:t>
             </w:r>
@@ -7413,9 +7408,10 @@
         </w:tc>
         <w:tc>
           <w:tcPr>
-            <w:tcW w:type="dxa" w:w="4514"/>
-          </w:tcPr>
-          <w:p>
+            <w:tcW w:type="dxa" w:w="8010"/>
+          </w:tcPr>
+          <w:p>
+            <w:pPr/>
             <w:r>
               <w:t>Payout phải dùng idempotency key và được xử lý ngoài HTTP request bởi background worker.</w:t>
             </w:r>
@@ -7425,9 +7421,10 @@
       <w:tr>
         <w:tc>
           <w:tcPr>
-            <w:tcW w:type="dxa" w:w="4514"/>
-          </w:tcPr>
-          <w:p>
+            <w:tcW w:type="dxa" w:w="1020"/>
+          </w:tcPr>
+          <w:p>
+            <w:pPr/>
             <w:r>
               <w:t>BR-90</w:t>
             </w:r>
@@ -7435,9 +7432,10 @@
         </w:tc>
         <w:tc>
           <w:tcPr>
-            <w:tcW w:type="dxa" w:w="4514"/>
-          </w:tcPr>
-          <w:p>
+            <w:tcW w:type="dxa" w:w="8010"/>
+          </w:tcPr>
+          <w:p>
+            <w:pPr/>
             <w:r>
               <w:t>Refund chỉ chuyển SUCCESS sau khi nhận xác nhận terminal rằng giao dịch tiền ra đã hoàn tất; trạng thái accepted/submitted không đủ.</w:t>
             </w:r>
@@ -7447,9 +7445,10 @@
       <w:tr>
         <w:tc>
           <w:tcPr>
-            <w:tcW w:type="dxa" w:w="4514"/>
-          </w:tcPr>
-          <w:p>
+            <w:tcW w:type="dxa" w:w="1020"/>
+          </w:tcPr>
+          <w:p>
+            <w:pPr/>
             <w:r>
               <w:t>BR-91</w:t>
             </w:r>
@@ -7457,9 +7456,10 @@
         </w:tc>
         <w:tc>
           <w:tcPr>
-            <w:tcW w:type="dxa" w:w="4514"/>
-          </w:tcPr>
-          <w:p>
+            <w:tcW w:type="dxa" w:w="8010"/>
+          </w:tcPr>
+          <w:p>
+            <w:pPr/>
             <w:r>
               <w:t>Sai tài khoản, không xác minh được hoặc payout thất bại terminal phải chuyển MANUAL_REQUIRED cho Admin; Manager chỉ được đọc.</w:t>
             </w:r>
@@ -7469,9 +7469,10 @@
       <w:tr>
         <w:tc>
           <w:tcPr>
-            <w:tcW w:type="dxa" w:w="4514"/>
-          </w:tcPr>
-          <w:p>
+            <w:tcW w:type="dxa" w:w="1020"/>
+          </w:tcPr>
+          <w:p>
+            <w:pPr/>
             <w:r>
               <w:t>BR-92</w:t>
             </w:r>
@@ -7479,9 +7480,10 @@
         </w:tc>
         <w:tc>
           <w:tcPr>
-            <w:tcW w:type="dxa" w:w="4514"/>
-          </w:tcPr>
-          <w:p>
+            <w:tcW w:type="dxa" w:w="8010"/>
+          </w:tcPr>
+          <w:p>
+            <w:pPr/>
             <w:r>
               <w:t>Thông báo hoàn tiền thành công chỉ được gửi sau khi transaction cập nhật Refund, Booking, Ticket và điểm thưởng đã commit.</w:t>
             </w:r>
@@ -7489,12 +7491,432 @@
         </w:tc>
       </w:tr>
     </w:tbl>
+    <w:p>
+      <w:pPr>
+        <w:pStyle w:val="Heading1"/>
+        <w:keepNext/>
+      </w:pPr>
+      <w:r>
+        <w:t>17. Nhóm rule về bồi thường khi rạp hủy suất chiếu</w:t>
+      </w:r>
+    </w:p>
     <w:sectPr>
       <w:footerReference r:id="rId6" w:type="default"/>
       <w:pgSz w:h="16834" w:w="11909" w:orient="portrait"/>
       <w:pgMar w:bottom="1440" w:top="1440" w:left="1440" w:right="1440" w:header="720" w:footer="720"/>
       <w:pgNumType w:start="1"/>
     </w:sectPr>
+    <w:tbl>
+      <w:tblPr>
+        <w:tblStyle w:val="Table15"/>
+        <w:tblW w:w="9030.0" w:type="dxa"/>
+        <w:jc w:val="left"/>
+        <w:tblBorders>
+          <w:top w:color="000000" w:space="0" w:sz="0" w:val="nil"/>
+          <w:left w:color="000000" w:space="0" w:sz="0" w:val="nil"/>
+          <w:bottom w:color="000000" w:space="0" w:sz="0" w:val="nil"/>
+          <w:right w:color="000000" w:space="0" w:sz="0" w:val="nil"/>
+          <w:insideH w:color="000000" w:space="0" w:sz="0" w:val="nil"/>
+          <w:insideV w:color="000000" w:space="0" w:sz="0" w:val="nil"/>
+        </w:tblBorders>
+        <w:tblLayout w:type="fixed"/>
+        <w:tblLook w:val="0600"/>
+      </w:tblPr>
+      <w:tblGrid>
+        <w:gridCol w:w="1020"/>
+        <w:gridCol w:w="8010"/>
+        <w:tblGridChange w:id="0">
+          <w:tblGrid>
+            <w:gridCol w:w="1020"/>
+            <w:gridCol w:w="8010"/>
+          </w:tblGrid>
+        </w:tblGridChange>
+      </w:tblGrid>
+      <w:tr>
+        <w:tc>
+          <w:tcPr>
+            <w:tcW w:type="dxa" w:w="1020"/>
+          </w:tcPr>
+          <w:p>
+            <w:pPr/>
+            <w:r>
+              <w:t>Mã</w:t>
+            </w:r>
+          </w:p>
+        </w:tc>
+        <w:tc>
+          <w:tcPr>
+            <w:tcW w:type="dxa" w:w="8010"/>
+          </w:tcPr>
+          <w:p>
+            <w:pPr/>
+            <w:r>
+              <w:t>Business Rule</w:t>
+            </w:r>
+          </w:p>
+        </w:tc>
+      </w:tr>
+      <w:tr>
+        <w:tc>
+          <w:tcPr>
+            <w:tcW w:type="dxa" w:w="1020"/>
+          </w:tcPr>
+          <w:p>
+            <w:pPr/>
+            <w:r>
+              <w:t>BR-93</w:t>
+            </w:r>
+          </w:p>
+        </w:tc>
+        <w:tc>
+          <w:tcPr>
+            <w:tcW w:type="dxa" w:w="8010"/>
+          </w:tcPr>
+          <w:p>
+            <w:pPr/>
+            <w:r>
+              <w:t>Khi Manager hoặc Admin hủy một suất chiếu chưa bắt đầu, mọi booking đã thanh toán của suất chiếu đó phải bị hủy và được cấp quyền lợi bồi thường; không tạo Refund, Refund Claim hoặc quyền đổi sang tiền mặt.</w:t>
+            </w:r>
+          </w:p>
+        </w:tc>
+      </w:tr>
+      <w:tr>
+        <w:tc>
+          <w:tcPr>
+            <w:tcW w:type="dxa" w:w="1020"/>
+          </w:tcPr>
+          <w:p>
+            <w:pPr/>
+            <w:r>
+              <w:t>BR-94</w:t>
+            </w:r>
+          </w:p>
+        </w:tc>
+        <w:tc>
+          <w:tcPr>
+            <w:tcW w:type="dxa" w:w="8010"/>
+          </w:tcPr>
+          <w:p>
+            <w:pPr/>
+            <w:r>
+              <w:t>Mỗi ghế đã thanh toán trong booking bị hủy được cấp đúng một voucher vé xem phim 100%; một booking có N ghế được cấp N voucher vé.</w:t>
+            </w:r>
+          </w:p>
+        </w:tc>
+      </w:tr>
+      <w:tr>
+        <w:tc>
+          <w:tcPr>
+            <w:tcW w:type="dxa" w:w="1020"/>
+          </w:tcPr>
+          <w:p>
+            <w:pPr/>
+            <w:r>
+              <w:t>BR-95</w:t>
+            </w:r>
+          </w:p>
+        </w:tc>
+        <w:tc>
+          <w:tcPr>
+            <w:tcW w:type="dxa" w:w="8010"/>
+          </w:tcPr>
+          <w:p>
+            <w:pPr/>
+            <w:r>
+              <w:t>Mỗi voucher vé bồi thường thanh toán toàn bộ giá của đúng một ghế, bao gồm giá cơ bản và mọi phụ thu; được dùng cho mọi phim, mọi cụm rạp, mọi phòng chiếu/định dạng (bao gồm IMAX, 4DX nếu có) và mọi loại ghế (bao gồm VIP), không có trần giá và Customer không phải trả phần chênh lệch của ghế đó.</w:t>
+            </w:r>
+          </w:p>
+        </w:tc>
+      </w:tr>
+      <w:tr>
+        <w:tc>
+          <w:tcPr>
+            <w:tcW w:type="dxa" w:w="1020"/>
+          </w:tcPr>
+          <w:p>
+            <w:pPr/>
+            <w:r>
+              <w:t>BR-96</w:t>
+            </w:r>
+          </w:p>
+        </w:tc>
+        <w:tc>
+          <w:tcPr>
+            <w:tcW w:type="dxa" w:w="8010"/>
+          </w:tcPr>
+          <w:p>
+            <w:pPr/>
+            <w:r>
+              <w:t>Mỗi booking đã thanh toán bị hủy được cấp đúng một voucher combo gồm 01 bắp rang cỡ vừa và 01 nước ngọt cỡ vừa; voucher combo được nhận tại bất kỳ cụm rạp đang hoạt động.</w:t>
+            </w:r>
+          </w:p>
+        </w:tc>
+      </w:tr>
+      <w:tr>
+        <w:tc>
+          <w:tcPr>
+            <w:tcW w:type="dxa" w:w="1020"/>
+          </w:tcPr>
+          <w:p>
+            <w:pPr/>
+            <w:r>
+              <w:t>BR-97</w:t>
+            </w:r>
+          </w:p>
+        </w:tc>
+        <w:tc>
+          <w:tcPr>
+            <w:tcW w:type="dxa" w:w="8010"/>
+          </w:tcPr>
+          <w:p>
+            <w:pPr/>
+            <w:r>
+              <w:t>Voucher vé và voucher combo bồi thường có hiệu lực 180 ngày kể từ issuedAt theo UTC; sau expiresAt hệ thống phải từ chối sử dụng.</w:t>
+            </w:r>
+          </w:p>
+        </w:tc>
+      </w:tr>
+      <w:tr>
+        <w:tc>
+          <w:tcPr>
+            <w:tcW w:type="dxa" w:w="1020"/>
+          </w:tcPr>
+          <w:p>
+            <w:pPr/>
+            <w:r>
+              <w:t>BR-98</w:t>
+            </w:r>
+          </w:p>
+        </w:tc>
+        <w:tc>
+          <w:tcPr>
+            <w:tcW w:type="dxa" w:w="8010"/>
+          </w:tcPr>
+          <w:p>
+            <w:pPr/>
+            <w:r>
+              <w:t>Quyền lợi bồi thường không được quy đổi thành tiền mặt, hoàn tiền, chuyển nhượng, bán lại hoặc gia hạn tự động sau khi hết hạn.</w:t>
+            </w:r>
+          </w:p>
+        </w:tc>
+      </w:tr>
+      <w:tr>
+        <w:tc>
+          <w:tcPr>
+            <w:tcW w:type="dxa" w:w="1020"/>
+          </w:tcPr>
+          <w:p>
+            <w:pPr/>
+            <w:r>
+              <w:t>BR-99</w:t>
+            </w:r>
+          </w:p>
+        </w:tc>
+        <w:tc>
+          <w:tcPr>
+            <w:tcW w:type="dxa" w:w="8010"/>
+          </w:tcPr>
+          <w:p>
+            <w:pPr/>
+            <w:r>
+              <w:t>Quyền lợi bồi thường phải gắn với CustomerProfile của booking gốc. Với booking guest tại quầy, việc sử dụng phải đối chiếu mã voucher cùng email và số điện thoại của booking gốc.</w:t>
+            </w:r>
+          </w:p>
+        </w:tc>
+      </w:tr>
+      <w:tr>
+        <w:tc>
+          <w:tcPr>
+            <w:tcW w:type="dxa" w:w="1020"/>
+          </w:tcPr>
+          <w:p>
+            <w:pPr/>
+            <w:r>
+              <w:t>BR-100</w:t>
+            </w:r>
+          </w:p>
+        </w:tc>
+        <w:tc>
+          <w:tcPr>
+            <w:tcW w:type="dxa" w:w="8010"/>
+          </w:tcPr>
+          <w:p>
+            <w:pPr/>
+            <w:r>
+              <w:t>Voucher vé bồi thường không được dùng đồng thời với voucher/promotion thông thường trong cùng booking.</w:t>
+            </w:r>
+          </w:p>
+        </w:tc>
+      </w:tr>
+      <w:tr>
+        <w:tc>
+          <w:tcPr>
+            <w:tcW w:type="dxa" w:w="1020"/>
+          </w:tcPr>
+          <w:p>
+            <w:pPr/>
+            <w:r>
+              <w:t>BR-101</w:t>
+            </w:r>
+          </w:p>
+        </w:tc>
+        <w:tc>
+          <w:tcPr>
+            <w:tcW w:type="dxa" w:w="8010"/>
+          </w:tcPr>
+          <w:p>
+            <w:pPr/>
+            <w:r>
+              <w:t>Nếu booking bị hủy đã dùng voucher thông thường, hệ thống phải khôi phục đúng CustomerVoucher đã dùng và điều chỉnh usedCount đúng một lần.</w:t>
+            </w:r>
+          </w:p>
+        </w:tc>
+      </w:tr>
+      <w:tr>
+        <w:tc>
+          <w:tcPr>
+            <w:tcW w:type="dxa" w:w="1020"/>
+          </w:tcPr>
+          <w:p>
+            <w:pPr/>
+            <w:r>
+              <w:t>BR-102</w:t>
+            </w:r>
+          </w:p>
+        </w:tc>
+        <w:tc>
+          <w:tcPr>
+            <w:tcW w:type="dxa" w:w="8010"/>
+          </w:tcPr>
+          <w:p>
+            <w:pPr/>
+            <w:r>
+              <w:t>Khi voucher vé bồi thường được áp dụng cho booking chờ thanh toán, quyền lợi chuyển sang Reserved; chỉ chuyển Redeemed sau khi booking Paid, và phải trở lại Issued nếu checkout bị hủy, timeout hoặc thanh toán thất bại.</w:t>
+            </w:r>
+          </w:p>
+        </w:tc>
+      </w:tr>
+      <w:tr>
+        <w:tc>
+          <w:tcPr>
+            <w:tcW w:type="dxa" w:w="1020"/>
+          </w:tcPr>
+          <w:p>
+            <w:pPr/>
+            <w:r>
+              <w:t>BR-103</w:t>
+            </w:r>
+          </w:p>
+        </w:tc>
+        <w:tc>
+          <w:tcPr>
+            <w:tcW w:type="dxa" w:w="8010"/>
+          </w:tcPr>
+          <w:p>
+            <w:pPr/>
+            <w:r>
+              <w:t>Việc cấp bồi thường phải idempotent theo sourceBookingId: mỗi booking gốc chỉ có một gói bồi thường; hệ thống phải ngăn hai request đồng thời dùng cùng một voucher vé hoặc voucher combo.</w:t>
+            </w:r>
+          </w:p>
+        </w:tc>
+      </w:tr>
+      <w:tr>
+        <w:tc>
+          <w:tcPr>
+            <w:tcW w:type="dxa" w:w="1020"/>
+          </w:tcPr>
+          <w:p>
+            <w:pPr/>
+            <w:r>
+              <w:t>BR-104</w:t>
+            </w:r>
+          </w:p>
+        </w:tc>
+        <w:tc>
+          <w:tcPr>
+            <w:tcW w:type="dxa" w:w="8010"/>
+          </w:tcPr>
+          <w:p>
+            <w:pPr/>
+            <w:r>
+              <w:t>Nếu tiền đến sau khi suất chiếu đã bị Manager/Admin hủy, Payment vẫn được ghi nhận Success nhưng booking giữ trạng thái Cancelled và được cấp cùng gói bồi thường tại BR-94 đến BR-97; không tạo luồng hoàn tiền.</w:t>
+            </w:r>
+          </w:p>
+        </w:tc>
+      </w:tr>
+      <w:tr>
+        <w:tc>
+          <w:tcPr>
+            <w:tcW w:type="dxa" w:w="1020"/>
+          </w:tcPr>
+          <w:p>
+            <w:pPr/>
+            <w:r>
+              <w:t>BR-105</w:t>
+            </w:r>
+          </w:p>
+        </w:tc>
+        <w:tc>
+          <w:tcPr>
+            <w:tcW w:type="dxa" w:w="8010"/>
+          </w:tcPr>
+          <w:p>
+            <w:pPr/>
+            <w:r>
+              <w:t>Các luồng hoàn tiền không phát sinh từ hủy suất chiếu của rạp, bao gồm tiền đến muộn cho booking hết hạn thông thường hoặc các trường hợp refund hợp lệ khác, tiếp tục áp dụng BR-84 đến BR-92.</w:t>
+            </w:r>
+          </w:p>
+        </w:tc>
+      </w:tr>
+      <w:tr>
+        <w:tc>
+          <w:tcPr>
+            <w:tcW w:type="dxa" w:w="1020"/>
+          </w:tcPr>
+          <w:p>
+            <w:pPr/>
+            <w:r>
+              <w:t>BR-106</w:t>
+            </w:r>
+          </w:p>
+        </w:tc>
+        <w:tc>
+          <w:tcPr>
+            <w:tcW w:type="dxa" w:w="8010"/>
+          </w:tcPr>
+          <w:p>
+            <w:pPr/>
+            <w:r>
+              <w:t>Thông báo bồi thường phải nêu số lượng voucher vé, mã voucher vé, mã voucher combo và expiresAt; thao tác hủy suất chiếu và số quyền lợi đã cấp phải được ghi audit log.</w:t>
+            </w:r>
+          </w:p>
+        </w:tc>
+      </w:tr>
+      <w:tr>
+        <w:tc>
+          <w:tcPr>
+            <w:tcW w:type="dxa" w:w="1020"/>
+          </w:tcPr>
+          <w:p>
+            <w:pPr/>
+            <w:r>
+              <w:t>BR-107</w:t>
+            </w:r>
+          </w:p>
+        </w:tc>
+        <w:tc>
+          <w:tcPr>
+            <w:tcW w:type="dxa" w:w="8010"/>
+          </w:tcPr>
+          <w:p>
+            <w:pPr/>
+            <w:r>
+              <w:t>Voucher combo chỉ được redeem một lần bởi Staff/Manager/Admin có StaffProfile đang Active; hệ thống phải lưu thời điểm, cụm rạp và nhân sự thực hiện.</w:t>
+            </w:r>
+          </w:p>
+        </w:tc>
+      </w:tr>
+    </w:tbl>
   </w:body>
 </w:document>
 </file>

</xml_diff>